<commit_message>
Fix lab builds and test discovery
</commit_message>
<xml_diff>
--- a/Lab2_BitString_variant7/Отчет_ЛР2_Сулейманов_Гарун_Баширович.docx
+++ b/Lab2_BitString_variant7/Отчет_ЛР2_Сулейманов_Гарун_Баширович.docx
@@ -1179,7 +1179,19 @@
         <w:br/>
         <w:t xml:space="preserve">    const BitString b("3"); // 0011 - тоже две единицы</w:t>
         <w:br/>
+        <w:t xml:space="preserve">    const BitString c("7"); // три единицы</w:t>
+        <w:br/>
         <w:t xml:space="preserve">    assert(a == b); // сравнение идет по числу единичных битов</w:t>
+        <w:br/>
+        <w:t xml:space="preserve">    assert(!(a != b)); // проверяем оператор !=</w:t>
+        <w:br/>
+        <w:t xml:space="preserve">    assert(a &lt;= b &amp;&amp; a &gt;= b); // проверяем сравнения с равным числом единиц</w:t>
+        <w:br/>
+        <w:t xml:space="preserve">    assert(a != c); // проверяем неравенство по числу единиц</w:t>
+        <w:br/>
+        <w:t xml:space="preserve">    assert(a &lt; c &amp;&amp; c &gt; a); // проверяем строгие сравнения</w:t>
+        <w:br/>
+        <w:t xml:space="preserve">    assert(c &gt;= a &amp;&amp; a &lt;= c); // проверяем нестрогие сравнения</w:t>
         <w:br/>
         <w:t xml:space="preserve">    assert(!a.sameBits(b)); // сами битовые строки при этом разные</w:t>
         <w:br/>
@@ -1383,7 +1395,7 @@
         <w:tblLook w:firstColumn="1" w:firstRow="1" w:lastColumn="0" w:lastRow="0" w:noHBand="0" w:noVBand="1" w:val="04A0"/>
       </w:tblPr>
       <w:tblGrid>
-        <w:gridCol w:w="397"/>
+        <w:gridCol w:w="605"/>
         <w:gridCol w:w="2948"/>
         <w:gridCol w:w="2268"/>
         <w:gridCol w:w="2268"/>
@@ -1392,7 +1404,7 @@
       <w:tr>
         <w:tc>
           <w:tcPr>
-            <w:tcW w:type="dxa" w:w="1961"/>
+            <w:tcW w:type="dxa" w:w="605"/>
             <w:shd w:fill="E7E7E7"/>
             <w:vAlign w:val="center"/>
             <w:tcMar>
@@ -1529,7 +1541,7 @@
       <w:tr>
         <w:tc>
           <w:tcPr>
-            <w:tcW w:type="dxa" w:w="397"/>
+            <w:tcW w:type="dxa" w:w="605"/>
             <w:vAlign w:val="center"/>
             <w:tcMar>
               <w:top w:w="100" w:type="dxa"/>
@@ -1653,7 +1665,7 @@
       <w:tr>
         <w:tc>
           <w:tcPr>
-            <w:tcW w:type="dxa" w:w="397"/>
+            <w:tcW w:type="dxa" w:w="605"/>
             <w:vAlign w:val="center"/>
             <w:tcMar>
               <w:top w:w="100" w:type="dxa"/>
@@ -1777,7 +1789,7 @@
       <w:tr>
         <w:tc>
           <w:tcPr>
-            <w:tcW w:type="dxa" w:w="397"/>
+            <w:tcW w:type="dxa" w:w="605"/>
             <w:vAlign w:val="center"/>
             <w:tcMar>
               <w:top w:w="100" w:type="dxa"/>
@@ -1901,7 +1913,7 @@
       <w:tr>
         <w:tc>
           <w:tcPr>
-            <w:tcW w:type="dxa" w:w="397"/>
+            <w:tcW w:type="dxa" w:w="605"/>
             <w:vAlign w:val="center"/>
             <w:tcMar>
               <w:top w:w="100" w:type="dxa"/>
@@ -2025,7 +2037,7 @@
       <w:tr>
         <w:tc>
           <w:tcPr>
-            <w:tcW w:type="dxa" w:w="397"/>
+            <w:tcW w:type="dxa" w:w="605"/>
             <w:vAlign w:val="center"/>
             <w:tcMar>
               <w:top w:w="100" w:type="dxa"/>
@@ -2149,7 +2161,7 @@
       <w:tr>
         <w:tc>
           <w:tcPr>
-            <w:tcW w:type="dxa" w:w="397"/>
+            <w:tcW w:type="dxa" w:w="605"/>
             <w:vAlign w:val="center"/>
             <w:tcMar>
               <w:top w:w="100" w:type="dxa"/>
@@ -2273,7 +2285,7 @@
       <w:tr>
         <w:tc>
           <w:tcPr>
-            <w:tcW w:type="dxa" w:w="397"/>
+            <w:tcW w:type="dxa" w:w="605"/>
             <w:vAlign w:val="center"/>
             <w:tcMar>
               <w:top w:w="100" w:type="dxa"/>
@@ -2397,7 +2409,7 @@
       <w:tr>
         <w:tc>
           <w:tcPr>
-            <w:tcW w:type="dxa" w:w="397"/>
+            <w:tcW w:type="dxa" w:w="605"/>
             <w:vAlign w:val="center"/>
             <w:tcMar>
               <w:top w:w="100" w:type="dxa"/>
@@ -2521,7 +2533,7 @@
       <w:tr>
         <w:tc>
           <w:tcPr>
-            <w:tcW w:type="dxa" w:w="397"/>
+            <w:tcW w:type="dxa" w:w="605"/>
             <w:vAlign w:val="center"/>
             <w:tcMar>
               <w:top w:w="100" w:type="dxa"/>
@@ -2645,7 +2657,7 @@
       <w:tr>
         <w:tc>
           <w:tcPr>
-            <w:tcW w:type="dxa" w:w="397"/>
+            <w:tcW w:type="dxa" w:w="605"/>
             <w:vAlign w:val="center"/>
             <w:tcMar>
               <w:top w:w="100" w:type="dxa"/>
@@ -2769,7 +2781,7 @@
       <w:tr>
         <w:tc>
           <w:tcPr>
-            <w:tcW w:type="dxa" w:w="397"/>
+            <w:tcW w:type="dxa" w:w="605"/>
             <w:vAlign w:val="center"/>
             <w:tcMar>
               <w:top w:w="100" w:type="dxa"/>
@@ -2893,7 +2905,7 @@
       <w:tr>
         <w:tc>
           <w:tcPr>
-            <w:tcW w:type="dxa" w:w="397"/>
+            <w:tcW w:type="dxa" w:w="605"/>
             <w:vAlign w:val="center"/>
             <w:tcMar>
               <w:top w:w="100" w:type="dxa"/>
@@ -3155,7 +3167,7 @@
     </w:p>
     <w:p>
       <w:r>
-        <w:t>assert() удобно применять для внутренних проверок и учебного самотестирования, но не следует использовать вместо обычной обработки пользовательских ошибок. При определенном макросе NDEBUG проверки assert() отключаются, поэтому для неправильного формата входной строки в программе отдельно применяется механизм исключений.</w:t>
+        <w:t>При определенном макросе NDEBUG проверки assert() отключаются. В конфигурации CMake для этой работы NDEBUG снимается у цели lab2, поэтому самопроверки остаются включенными в Debug и Release; команда CTest запускает их автоматически. Для неправильного формата входной строки в программе отдельно применяется механизм исключений.</w:t>
       </w:r>
     </w:p>
     <w:p>

</xml_diff>